<commit_message>
Updated Memoria por -no-pie problem especification
</commit_message>
<xml_diff>
--- a/docs/ssoo_plantilla_memoria_práctica_minishell.docx
+++ b/docs/ssoo_plantilla_memoria_práctica_minishell.docx
@@ -17954,14 +17954,7 @@
                 <w:b/>
                 <w:bCs/>
               </w:rPr>
-              <w:t>is_</w:t>
-            </w:r>
-            <w:r>
-              <w:rPr>
-                <w:b/>
-                <w:bCs/>
-              </w:rPr>
-              <w:t>empty_or_space</w:t>
+              <w:t>is_empty_or_space</w:t>
             </w:r>
             <w:proofErr w:type="spellEnd"/>
           </w:p>
@@ -22450,9 +22443,9 @@
           <w:i/>
           <w:iCs/>
           <w:u w:val="single"/>
-        </w:rPr>
-      </w:pPr>
-      <w:proofErr w:type="spellStart"/>
+          <w:lang w:val="es-ES"/>
+        </w:rPr>
+      </w:pPr>
       <w:r>
         <w:rPr>
           <w:b/>
@@ -22460,99 +22453,219 @@
           <w:i/>
           <w:iCs/>
           <w:u w:val="single"/>
-        </w:rPr>
-        <w:t>Job_list</w:t>
-      </w:r>
-      <w:proofErr w:type="spellEnd"/>
+          <w:lang w:val="es-ES"/>
+        </w:rPr>
+        <w:t>Problema de compilación con librería estática y ejecutables PIE</w:t>
+      </w:r>
     </w:p>
     <w:p>
       <w:r>
-        <w:t xml:space="preserve">Al crear la lista </w:t>
-      </w:r>
-      <w:r>
-        <w:t>e</w:t>
-      </w:r>
-      <w:r>
-        <w:t xml:space="preserve"> introducir en ella un mayor número de elementos, nos dimos cuenta </w:t>
-      </w:r>
-      <w:r>
-        <w:t>de que</w:t>
-      </w:r>
-      <w:r>
-        <w:t xml:space="preserve"> no la inicializábamos de manera correcta. Por ello, nos daba constantemente </w:t>
+        <w:t xml:space="preserve">El problema surge debido a la incompatibilidad entre </w:t>
+      </w:r>
+      <w:r>
+        <w:rPr>
+          <w:b/>
+          <w:bCs/>
+        </w:rPr>
+        <w:t>librerías estáticas no-PIC</w:t>
+      </w:r>
+      <w:r>
+        <w:t xml:space="preserve"> y ejecutables </w:t>
+      </w:r>
+      <w:r>
+        <w:rPr>
+          <w:b/>
+          <w:bCs/>
+        </w:rPr>
+        <w:t>PIE</w:t>
+      </w:r>
+      <w:r>
+        <w:t>, que son el estándar por defecto en distribuciones modernas. La solución ideal es recompilar la librería con -</w:t>
       </w:r>
       <w:proofErr w:type="spellStart"/>
       <w:r>
-        <w:rPr>
+        <w:t>fPIC</w:t>
+      </w:r>
+      <w:proofErr w:type="spellEnd"/>
+      <w:r>
+        <w:t xml:space="preserve">. </w:t>
+      </w:r>
+      <w:r>
+        <w:t xml:space="preserve">Tras intentar ejecutar la compilación del proyecto, nos daba un error relativo a este problema. Después de una extensa búsqueda de información, llegamos a la conclusión de que la mejor opción era recompilar el código del </w:t>
+      </w:r>
+      <w:proofErr w:type="spellStart"/>
+      <w:r>
+        <w:t>parser</w:t>
+      </w:r>
+      <w:proofErr w:type="spellEnd"/>
+      <w:r>
+        <w:t xml:space="preserve">. </w:t>
+      </w:r>
+      <w:r>
+        <w:t xml:space="preserve">Sin embargo, </w:t>
+      </w:r>
+      <w:r>
+        <w:t xml:space="preserve">como no </w:t>
+      </w:r>
+      <w:r>
+        <w:t>t</w:t>
+      </w:r>
+      <w:r>
+        <w:t xml:space="preserve">eníamos </w:t>
+      </w:r>
+      <w:r>
+        <w:t xml:space="preserve">acceso al código fuente, se </w:t>
+      </w:r>
+      <w:r>
+        <w:t xml:space="preserve">optó </w:t>
+      </w:r>
+      <w:r>
+        <w:t>por deshabilitar PIE usando la opción -no-pie al compilar el ejecutable.</w:t>
+      </w:r>
+      <w:r>
+        <w:t xml:space="preserve"> Es decir, la línea de compilación dentro del IDE es:  </w:t>
+      </w:r>
+      <w:proofErr w:type="spellStart"/>
+      <w:r>
+        <w:rPr>
+          <w:b/>
+          <w:bCs/>
           <w:i/>
           <w:iCs/>
         </w:rPr>
-        <w:t>segmentation</w:t>
+        <w:t>gcc</w:t>
       </w:r>
       <w:proofErr w:type="spellEnd"/>
       <w:r>
         <w:rPr>
+          <w:b/>
+          <w:bCs/>
           <w:i/>
           <w:iCs/>
         </w:rPr>
-        <w:t xml:space="preserve"> </w:t>
+        <w:t xml:space="preserve"> -Wall -</w:t>
       </w:r>
       <w:proofErr w:type="spellStart"/>
       <w:r>
         <w:rPr>
+          <w:b/>
+          <w:bCs/>
           <w:i/>
           <w:iCs/>
         </w:rPr>
-        <w:t>fault</w:t>
+        <w:t>Wextra</w:t>
       </w:r>
       <w:proofErr w:type="spellEnd"/>
-      <w:r>
-        <w:t xml:space="preserve">, debido a la mala inicialización del espacio de memoria reservado para la misma. Además, fue muy difícil visualizar en cada momento el contenido de </w:t>
-      </w:r>
-      <w:r>
-        <w:t>esta</w:t>
-      </w:r>
-      <w:r>
-        <w:t>, por lo que tuvim</w:t>
-      </w:r>
-      <w:r>
-        <w:t>os que implementar una función adicional “</w:t>
-      </w:r>
-      <w:proofErr w:type="spellStart"/>
-      <w:r>
-        <w:t>debug</w:t>
-      </w:r>
-      <w:proofErr w:type="spellEnd"/>
-      <w:r>
-        <w:t>” para comprobar en todo momento qué procesos se estaban guardando en ella y su información (</w:t>
-      </w:r>
-      <w:proofErr w:type="spellStart"/>
-      <w:r>
-        <w:t>PIDs</w:t>
-      </w:r>
-      <w:proofErr w:type="spellEnd"/>
-      <w:r>
-        <w:t xml:space="preserve"> de los hijos, estado, comando correspondiente, estado mostrado o pendiente de mostrar, etc.). </w:t>
-      </w:r>
       <w:r>
         <w:rPr>
           <w:b/>
           <w:bCs/>
-        </w:rPr>
-        <w:t xml:space="preserve">Dicha funcionalidad fue preguntada con anterioridad a los profesores </w:t>
-      </w:r>
-      <w:r>
-        <w:t xml:space="preserve">de la asignatura (al no venir indicada en el enunciado), </w:t>
-      </w:r>
+          <w:i/>
+          <w:iCs/>
+        </w:rPr>
+        <w:t xml:space="preserve"> -o </w:t>
+      </w:r>
+      <w:proofErr w:type="spellStart"/>
       <w:r>
         <w:rPr>
           <w:b/>
           <w:bCs/>
-        </w:rPr>
-        <w:t>dando su visto bueno para dejarla incluida en el proyecto final.</w:t>
+          <w:i/>
+          <w:iCs/>
+        </w:rPr>
+        <w:t>minishell</w:t>
+      </w:r>
+      <w:proofErr w:type="spellEnd"/>
+      <w:r>
+        <w:rPr>
+          <w:b/>
+          <w:bCs/>
+          <w:i/>
+          <w:iCs/>
+        </w:rPr>
+        <w:t xml:space="preserve"> </w:t>
+      </w:r>
+      <w:proofErr w:type="spellStart"/>
+      <w:r>
+        <w:rPr>
+          <w:b/>
+          <w:bCs/>
+          <w:i/>
+          <w:iCs/>
+        </w:rPr>
+        <w:t>minishell.c</w:t>
+      </w:r>
+      <w:proofErr w:type="spellEnd"/>
+      <w:r>
+        <w:rPr>
+          <w:b/>
+          <w:bCs/>
+          <w:i/>
+          <w:iCs/>
+        </w:rPr>
+        <w:t xml:space="preserve"> -L./</w:t>
+      </w:r>
+      <w:proofErr w:type="spellStart"/>
+      <w:r>
+        <w:rPr>
+          <w:b/>
+          <w:bCs/>
+          <w:i/>
+          <w:iCs/>
+        </w:rPr>
+        <w:t>parser</w:t>
+      </w:r>
+      <w:proofErr w:type="spellEnd"/>
+      <w:r>
+        <w:rPr>
+          <w:b/>
+          <w:bCs/>
+          <w:i/>
+          <w:iCs/>
+        </w:rPr>
+        <w:t xml:space="preserve"> -</w:t>
+      </w:r>
+      <w:proofErr w:type="spellStart"/>
+      <w:r>
+        <w:rPr>
+          <w:b/>
+          <w:bCs/>
+          <w:i/>
+          <w:iCs/>
+        </w:rPr>
+        <w:t>lparser</w:t>
+      </w:r>
+      <w:proofErr w:type="spellEnd"/>
+      <w:r>
+        <w:rPr>
+          <w:b/>
+          <w:bCs/>
+          <w:i/>
+          <w:iCs/>
+        </w:rPr>
+        <w:t xml:space="preserve"> -I./</w:t>
+      </w:r>
+      <w:proofErr w:type="spellStart"/>
+      <w:r>
+        <w:rPr>
+          <w:b/>
+          <w:bCs/>
+          <w:i/>
+          <w:iCs/>
+        </w:rPr>
+        <w:t>parser</w:t>
+      </w:r>
+      <w:proofErr w:type="spellEnd"/>
+      <w:r>
+        <w:rPr>
+          <w:b/>
+          <w:bCs/>
+          <w:i/>
+          <w:iCs/>
+        </w:rPr>
+        <w:t xml:space="preserve"> -no-pie</w:t>
       </w:r>
     </w:p>
-    <w:p/>
     <w:p>
       <w:pPr>
         <w:rPr>
@@ -22563,6 +22676,7 @@
           <w:u w:val="single"/>
         </w:rPr>
       </w:pPr>
+      <w:proofErr w:type="spellStart"/>
       <w:r>
         <w:rPr>
           <w:b/>
@@ -22571,18 +22685,25 @@
           <w:iCs/>
           <w:u w:val="single"/>
         </w:rPr>
-        <w:t>Tratamiento de procesos en suspensión</w:t>
-      </w:r>
+        <w:t>Job_list</w:t>
+      </w:r>
+      <w:proofErr w:type="spellEnd"/>
     </w:p>
     <w:p>
       <w:r>
-        <w:t xml:space="preserve">Al implementar el control de señales de una manera simple (es decir, mandando la señal correspondiente a los procesos hijos) nos dimos cuenta </w:t>
+        <w:t xml:space="preserve">Al crear la lista </w:t>
+      </w:r>
+      <w:r>
+        <w:t>e</w:t>
+      </w:r>
+      <w:r>
+        <w:t xml:space="preserve"> introducir en ella un mayor número de elementos, nos dimos cuenta </w:t>
       </w:r>
       <w:r>
         <w:t>de que</w:t>
       </w:r>
       <w:r>
-        <w:t xml:space="preserve"> el programa no era capaz de diferenciar entre el proceso de ejecución de la propia Shell con el proceso en </w:t>
+        <w:t xml:space="preserve"> no la inicializábamos de manera correcta. Por ello, nos daba constantemente </w:t>
       </w:r>
       <w:proofErr w:type="spellStart"/>
       <w:r>
@@ -22590,118 +22711,72 @@
           <w:i/>
           <w:iCs/>
         </w:rPr>
-        <w:t>foregorund</w:t>
+        <w:t>segmentation</w:t>
       </w:r>
       <w:proofErr w:type="spellEnd"/>
-      <w:r>
-        <w:t xml:space="preserve">, cuya consecuencia fue que al hacer </w:t>
-      </w:r>
-      <w:proofErr w:type="spellStart"/>
       <w:r>
         <w:rPr>
           <w:i/>
           <w:iCs/>
         </w:rPr>
-        <w:t>ctrl+z</w:t>
-      </w:r>
-      <w:proofErr w:type="spellEnd"/>
+        <w:t xml:space="preserve"> </w:t>
+      </w:r>
+      <w:proofErr w:type="spellStart"/>
       <w:r>
         <w:rPr>
           <w:i/>
           <w:iCs/>
         </w:rPr>
-        <w:t xml:space="preserve"> </w:t>
-      </w:r>
-      <w:r>
-        <w:t xml:space="preserve">finalizaba el proceso padre de la </w:t>
+        <w:t>fault</w:t>
+      </w:r>
+      <w:proofErr w:type="spellEnd"/>
+      <w:r>
+        <w:t xml:space="preserve">, debido a la mala inicialización del espacio de memoria reservado para la misma. Además, fue muy difícil visualizar en cada momento el contenido de </w:t>
+      </w:r>
+      <w:r>
+        <w:t>esta</w:t>
+      </w:r>
+      <w:r>
+        <w:t>, por lo que tuvim</w:t>
+      </w:r>
+      <w:r>
+        <w:t>os que implementar una función adicional “</w:t>
       </w:r>
       <w:proofErr w:type="spellStart"/>
       <w:r>
-        <w:t>minishell</w:t>
+        <w:t>debug</w:t>
       </w:r>
       <w:proofErr w:type="spellEnd"/>
       <w:r>
-        <w:t xml:space="preserve">.  Tras investigar los distintos tipos de señales que podíamos utilizar en el </w:t>
+        <w:t>” para comprobar en todo momento qué procesos se estaban guardando en ella y su información (</w:t>
       </w:r>
       <w:proofErr w:type="spellStart"/>
       <w:r>
-        <w:t>waitpid</w:t>
+        <w:t>PIDs</w:t>
       </w:r>
       <w:proofErr w:type="spellEnd"/>
       <w:r>
-        <w:t xml:space="preserve">, nos dimos cuenta </w:t>
-      </w:r>
-      <w:proofErr w:type="gramStart"/>
-      <w:r>
-        <w:t>que</w:t>
-      </w:r>
-      <w:proofErr w:type="gramEnd"/>
-      <w:r>
-        <w:t xml:space="preserve"> podíamos controlar este problema si gestionábamos cada proceso como un grupo, y además controlábamos el estado con la señal </w:t>
-      </w:r>
-      <w:proofErr w:type="spellStart"/>
-      <w:r>
-        <w:rPr>
-          <w:i/>
-          <w:iCs/>
-        </w:rPr>
-        <w:t>waitpid</w:t>
-      </w:r>
-      <w:proofErr w:type="spellEnd"/>
-      <w:r>
-        <w:rPr>
-          <w:i/>
-          <w:iCs/>
-        </w:rPr>
-        <w:t xml:space="preserve"> </w:t>
-      </w:r>
-      <w:r>
-        <w:t xml:space="preserve">con la macro </w:t>
-      </w:r>
-      <w:r>
-        <w:rPr>
-          <w:i/>
-          <w:iCs/>
-        </w:rPr>
-        <w:t>WUNTRACED</w:t>
-      </w:r>
-      <w:r>
-        <w:t xml:space="preserve">. De esta manera, fuimos capaces de poder establecer las señales de manera correcta, de tal manera que suspendiese el proceso en </w:t>
-      </w:r>
-      <w:proofErr w:type="spellStart"/>
-      <w:r>
-        <w:rPr>
-          <w:i/>
-          <w:iCs/>
-        </w:rPr>
-        <w:t>foreground</w:t>
-      </w:r>
-      <w:proofErr w:type="spellEnd"/>
-      <w:r>
-        <w:t xml:space="preserve"> (mandando </w:t>
-      </w:r>
-      <w:r>
-        <w:t>a la correspondiente señal</w:t>
-      </w:r>
-      <w:r>
-        <w:t xml:space="preserve"> a cada uno de los hijos) sin matar a la </w:t>
-      </w:r>
-      <w:proofErr w:type="spellStart"/>
-      <w:r>
-        <w:t>shell</w:t>
-      </w:r>
-      <w:proofErr w:type="spellEnd"/>
-      <w:r>
-        <w:t>.</w:t>
+        <w:t xml:space="preserve"> de los hijos, estado, comando correspondiente, estado mostrado o pendiente de mostrar, etc.). </w:t>
+      </w:r>
+      <w:r>
+        <w:rPr>
+          <w:b/>
+          <w:bCs/>
+        </w:rPr>
+        <w:t xml:space="preserve">Dicha funcionalidad fue preguntada con anterioridad a los profesores </w:t>
+      </w:r>
+      <w:r>
+        <w:t xml:space="preserve">de la asignatura (al no venir indicada en el enunciado), </w:t>
+      </w:r>
+      <w:r>
+        <w:rPr>
+          <w:b/>
+          <w:bCs/>
+        </w:rPr>
+        <w:t>dando su visto bueno para dejarla incluida en el proyecto final.</w:t>
       </w:r>
     </w:p>
-    <w:p>
-      <w:pPr>
-        <w:rPr>
-          <w:u w:val="single"/>
-        </w:rPr>
-      </w:pPr>
-    </w:p>
+    <w:p/>
     <w:p>
       <w:pPr>
         <w:rPr>
@@ -22720,18 +22795,137 @@
           <w:iCs/>
           <w:u w:val="single"/>
         </w:rPr>
-        <w:t>Tratamiento de señales a procesos hijos</w:t>
+        <w:t>Tratamiento de procesos en suspensión</w:t>
       </w:r>
     </w:p>
     <w:p>
       <w:r>
-        <w:t xml:space="preserve">Para establecer el comportamiento de los procesos hijos ante la llegada de señales, nos encontramos con que, al establecer una señal como ignorada, </w:t>
-      </w:r>
-      <w:r>
-        <w:t>no era posible volver a cambiar ese comportamiento. Tuvimos entonces que recurrir al uso de manejadores para cada señal, además de establecer el comportamiento por defecto de esas señales en los procesos hijos.</w:t>
+        <w:t xml:space="preserve">Al implementar el control de señales de una manera simple (es decir, mandando la señal correspondiente a los procesos hijos) nos dimos cuenta </w:t>
+      </w:r>
+      <w:r>
+        <w:t>de que</w:t>
+      </w:r>
+      <w:r>
+        <w:t xml:space="preserve"> el programa no era capaz de diferenciar entre el proceso de ejecución de la propia Shell con el proceso en </w:t>
+      </w:r>
+      <w:proofErr w:type="spellStart"/>
+      <w:r>
+        <w:rPr>
+          <w:i/>
+          <w:iCs/>
+        </w:rPr>
+        <w:t>foregorund</w:t>
+      </w:r>
+      <w:proofErr w:type="spellEnd"/>
+      <w:r>
+        <w:t xml:space="preserve">, cuya consecuencia fue que al hacer </w:t>
+      </w:r>
+      <w:proofErr w:type="spellStart"/>
+      <w:r>
+        <w:rPr>
+          <w:i/>
+          <w:iCs/>
+        </w:rPr>
+        <w:t>ctrl+z</w:t>
+      </w:r>
+      <w:proofErr w:type="spellEnd"/>
+      <w:r>
+        <w:rPr>
+          <w:i/>
+          <w:iCs/>
+        </w:rPr>
+        <w:t xml:space="preserve"> </w:t>
+      </w:r>
+      <w:r>
+        <w:t xml:space="preserve">finalizaba el proceso padre de la </w:t>
+      </w:r>
+      <w:proofErr w:type="spellStart"/>
+      <w:r>
+        <w:t>minishell</w:t>
+      </w:r>
+      <w:proofErr w:type="spellEnd"/>
+      <w:r>
+        <w:t xml:space="preserve">.  Tras investigar los distintos tipos de señales que podíamos utilizar en el </w:t>
+      </w:r>
+      <w:proofErr w:type="spellStart"/>
+      <w:r>
+        <w:t>waitpid</w:t>
+      </w:r>
+      <w:proofErr w:type="spellEnd"/>
+      <w:r>
+        <w:t xml:space="preserve">, nos dimos cuenta </w:t>
+      </w:r>
+      <w:proofErr w:type="gramStart"/>
+      <w:r>
+        <w:t>que</w:t>
+      </w:r>
+      <w:proofErr w:type="gramEnd"/>
+      <w:r>
+        <w:t xml:space="preserve"> podíamos controlar este problema si gestionábamos cada proceso como un grupo, y además controlábamos el estado con la señal </w:t>
+      </w:r>
+      <w:proofErr w:type="spellStart"/>
+      <w:r>
+        <w:rPr>
+          <w:i/>
+          <w:iCs/>
+        </w:rPr>
+        <w:t>waitpid</w:t>
+      </w:r>
+      <w:proofErr w:type="spellEnd"/>
+      <w:r>
+        <w:rPr>
+          <w:i/>
+          <w:iCs/>
+        </w:rPr>
+        <w:t xml:space="preserve"> </w:t>
+      </w:r>
+      <w:r>
+        <w:t xml:space="preserve">con la macro </w:t>
+      </w:r>
+      <w:r>
+        <w:rPr>
+          <w:i/>
+          <w:iCs/>
+        </w:rPr>
+        <w:t>WUNTRACED</w:t>
+      </w:r>
+      <w:r>
+        <w:t xml:space="preserve">. De esta manera, fuimos capaces de poder establecer las señales de manera correcta, de tal manera que suspendiese el proceso en </w:t>
+      </w:r>
+      <w:proofErr w:type="spellStart"/>
+      <w:r>
+        <w:rPr>
+          <w:i/>
+          <w:iCs/>
+        </w:rPr>
+        <w:t>foreground</w:t>
+      </w:r>
+      <w:proofErr w:type="spellEnd"/>
+      <w:r>
+        <w:t xml:space="preserve"> (mandando </w:t>
+      </w:r>
+      <w:r>
+        <w:t>a la correspondiente señal</w:t>
+      </w:r>
+      <w:r>
+        <w:t xml:space="preserve"> a cada uno de los hijos) sin matar a la </w:t>
+      </w:r>
+      <w:proofErr w:type="spellStart"/>
+      <w:r>
+        <w:t>shell</w:t>
+      </w:r>
+      <w:proofErr w:type="spellEnd"/>
+      <w:r>
+        <w:t>.</w:t>
       </w:r>
     </w:p>
-    <w:p/>
+    <w:p>
+      <w:pPr>
+        <w:rPr>
+          <w:u w:val="single"/>
+        </w:rPr>
+      </w:pPr>
+    </w:p>
     <w:p>
       <w:pPr>
         <w:rPr>
@@ -22750,9 +22944,20 @@
           <w:iCs/>
           <w:u w:val="single"/>
         </w:rPr>
-        <w:t xml:space="preserve">Tratamiento de </w:t>
-      </w:r>
-      <w:r>
+        <w:t>Tratamiento de señales a procesos hijos</w:t>
+      </w:r>
+    </w:p>
+    <w:p>
+      <w:r>
+        <w:t xml:space="preserve">Para establecer el comportamiento de los procesos hijos ante la llegada de señales, nos encontramos con que, al establecer una señal como ignorada, </w:t>
+      </w:r>
+      <w:r>
+        <w:t>no era posible volver a cambiar ese comportamiento. Tuvimos entonces que recurrir al uso de manejadores para cada señal, además de establecer el comportamiento por defecto de esas señales en los procesos hijos.</w:t>
+      </w:r>
+    </w:p>
+    <w:p/>
+    <w:p>
+      <w:pPr>
         <w:rPr>
           <w:b/>
           <w:bCs/>
@@ -22760,9 +22965,7 @@
           <w:iCs/>
           <w:u w:val="single"/>
         </w:rPr>
-        <w:t xml:space="preserve">líneas que sólo contienen espacios o </w:t>
-      </w:r>
-      <w:proofErr w:type="spellStart"/>
+      </w:pPr>
       <w:r>
         <w:rPr>
           <w:b/>
@@ -22771,9 +22974,8 @@
           <w:iCs/>
           <w:u w:val="single"/>
         </w:rPr>
-        <w:t>enter</w:t>
-      </w:r>
-      <w:proofErr w:type="spellEnd"/>
+        <w:t xml:space="preserve">Tratamiento de </w:t>
+      </w:r>
       <w:r>
         <w:rPr>
           <w:b/>
@@ -22782,7 +22984,7 @@
           <w:iCs/>
           <w:u w:val="single"/>
         </w:rPr>
-        <w:t xml:space="preserve"> sin input en </w:t>
+        <w:t xml:space="preserve">líneas que sólo contienen espacios o </w:t>
       </w:r>
       <w:proofErr w:type="spellStart"/>
       <w:r>
@@ -22793,12 +22995,35 @@
           <w:iCs/>
           <w:u w:val="single"/>
         </w:rPr>
+        <w:t>enter</w:t>
+      </w:r>
+      <w:proofErr w:type="spellEnd"/>
+      <w:r>
+        <w:rPr>
+          <w:b/>
+          <w:bCs/>
+          <w:i/>
+          <w:iCs/>
+          <w:u w:val="single"/>
+        </w:rPr>
+        <w:t xml:space="preserve"> sin input en </w:t>
+      </w:r>
+      <w:proofErr w:type="spellStart"/>
+      <w:r>
+        <w:rPr>
+          <w:b/>
+          <w:bCs/>
+          <w:i/>
+          <w:iCs/>
+          <w:u w:val="single"/>
+        </w:rPr>
         <w:t>prompt</w:t>
       </w:r>
       <w:proofErr w:type="spellEnd"/>
     </w:p>
     <w:p>
       <w:r>
+        <w:lastRenderedPageBreak/>
         <w:t xml:space="preserve">Tras realizar varias pruebas, nos dimos cuenta de que, si al </w:t>
       </w:r>
       <w:proofErr w:type="spellStart"/>
@@ -22886,14 +23111,7 @@
           <w:i/>
           <w:iCs/>
         </w:rPr>
-        <w:t>&gt;</w:t>
-      </w:r>
-      <w:r>
-        <w:rPr>
-          <w:i/>
-          <w:iCs/>
-        </w:rPr>
-        <w:t xml:space="preserve">, </w:t>
+        <w:t xml:space="preserve">&gt;, </w:t>
       </w:r>
       <w:r>
         <w:t>que proporciona funciones para realizar operaciones comunes relacionadas con la clasificación y manipulación de caracteres</w:t>
@@ -22908,7 +23126,6 @@
       </w:pPr>
       <w:bookmarkStart w:id="12" w:name="_Toc185427530"/>
       <w:r>
-        <w:lastRenderedPageBreak/>
         <w:t>Críticas constructivas</w:t>
       </w:r>
       <w:bookmarkEnd w:id="12"/>
@@ -22979,9 +23196,9 @@
       <w:pPr>
         <w:pStyle w:val="Ttulo2"/>
       </w:pPr>
-      <w:bookmarkStart w:id="16" w:name="_Toc185427534"/>
-      <w:bookmarkStart w:id="17" w:name="_Diagrama_de_flujo"/>
-      <w:bookmarkEnd w:id="17"/>
+      <w:bookmarkStart w:id="16" w:name="_Diagrama_de_flujo"/>
+      <w:bookmarkStart w:id="17" w:name="_Toc185427534"/>
+      <w:bookmarkEnd w:id="16"/>
       <w:r>
         <w:rPr>
           <w:noProof/>
@@ -23046,7 +23263,7 @@
       <w:r>
         <w:t>Diagrama de flujo del programa principal</w:t>
       </w:r>
-      <w:bookmarkEnd w:id="16"/>
+      <w:bookmarkEnd w:id="17"/>
     </w:p>
     <w:p/>
     <w:p/>
@@ -29784,9 +30001,11 @@
     <w:rsid w:val="0097458C"/>
     <w:rsid w:val="009A071C"/>
     <w:rsid w:val="00A26E2E"/>
+    <w:rsid w:val="00AA0BE5"/>
     <w:rsid w:val="00B25FB1"/>
     <w:rsid w:val="00D12631"/>
     <w:rsid w:val="00E362F4"/>
+    <w:rsid w:val="00F6328A"/>
     <w:rsid w:val="00F7428C"/>
   </w:rsids>
   <m:mathPr>

</xml_diff>